<commit_message>
Surat pernyataan: NIK dan alamat sesuai KTP
Co-Authored-By: Claude Opus 5.5 <noreply@anthropic.com>
Claude-Session: https://claude.ai/code/session_015QgHdSLfePpTibzjhrwyeB
</commit_message>
<xml_diff>
--- a/app/assets/unduh/surat-pernyataan-keaslian-naskah.docx
+++ b/app/assets/unduh/surat-pernyataan-keaslian-naskah.docx
@@ -52,7 +52,7 @@
         <w:spacing w:after="100"/>
       </w:pPr>
       <w:r>
-        <w:t>NIK</w:t>
+        <w:t>NIK (sesuai KTP)</w:t>
         <w:tab/>
         <w:t>:</w:t>
         <w:tab/>
@@ -97,7 +97,7 @@
         <w:spacing w:after="100"/>
       </w:pPr>
       <w:r>
-        <w:t>Alamat</w:t>
+        <w:t>Alamat (sesuai KTP)</w:t>
         <w:tab/>
         <w:t>:</w:t>
         <w:tab/>

</xml_diff>